<commit_message>
Mailbox flyer: logo, QR code, about section, print-ready A4 PDF
Co-Authored-By: Claude Opus 5.5 <noreply@anthropic.com>
Claude-Session: https://claude.ai/code/session_01KtfkwQ8eYc32EDNhFFXirt
</commit_message>
<xml_diff>
--- a/letters/shirel-prager-refinance-letter.docx
+++ b/letters/shirel-prager-refinance-letter.docx
@@ -4,88 +4,12 @@
   <w:body>
     <w:p>
       <w:pPr>
-        <w:bidi/>
-        <w:spacing w:after="40" w:line="300"/>
-        <w:jc w:val="start"/>
-      </w:pPr>
-      <w:r>
-        <w:rPr>
-          <w:rFonts w:ascii="Arial" w:cs="Arial" w:eastAsia="Arial" w:hAnsi="Arial"/>
-          <w:b/>
-          <w:bCs/>
-          <w:color w:val="1F3A5F"/>
-          <w:sz w:val="46"/>
-          <w:szCs w:val="46"/>
-          <w:rtl/>
-        </w:rPr>
-        <w:t xml:space="preserve">מאז שלקחתם משכנתה, הרבה השתנה</w:t>
-      </w:r>
-    </w:p>
-    <w:p>
-      <w:pPr>
-        <w:pBdr>
-          <w:bottom w:val="single" w:color="1F3A5F" w:sz="12" w:space="6"/>
-        </w:pBdr>
-        <w:bidi/>
-        <w:spacing w:after="160" w:line="300"/>
-        <w:jc w:val="start"/>
-      </w:pPr>
-      <w:r>
-        <w:rPr>
-          <w:rFonts w:ascii="Arial" w:cs="Arial" w:eastAsia="Arial" w:hAnsi="Arial"/>
-          <w:b/>
-          <w:bCs/>
-          <w:color w:val="12805C"/>
-          <w:sz w:val="30"/>
-          <w:szCs w:val="30"/>
-          <w:rtl/>
-        </w:rPr>
-        <w:t xml:space="preserve">אולי זה הזמן לבדוק אם אתם משלמים לבנק יותר ממה שצריך</w:t>
-      </w:r>
-    </w:p>
-    <w:p>
-      <w:pPr>
-        <w:bidi/>
-        <w:spacing w:after="140" w:line="300"/>
-        <w:jc w:val="start"/>
-      </w:pPr>
-      <w:r>
-        <w:rPr>
-          <w:rFonts w:ascii="Arial" w:cs="Arial" w:eastAsia="Arial" w:hAnsi="Arial"/>
-          <w:b/>
-          <w:bCs/>
-          <w:sz w:val="25"/>
-          <w:szCs w:val="25"/>
-          <w:rtl/>
-        </w:rPr>
-        <w:t xml:space="preserve">שלום לדיירי הפרויקט,</w:t>
-      </w:r>
-    </w:p>
-    <w:p>
-      <w:pPr>
-        <w:bidi/>
-        <w:spacing w:after="140" w:line="300"/>
-        <w:jc w:val="start"/>
-      </w:pPr>
-      <w:r>
-        <w:rPr>
-          <w:rFonts w:ascii="Arial" w:cs="Arial" w:eastAsia="Arial" w:hAnsi="Arial"/>
-          <w:sz w:val="25"/>
-          <w:szCs w:val="25"/>
-          <w:rtl/>
-        </w:rPr>
-        <w:t xml:space="preserve">מאז מרץ 2023 עברנו תקופה לא פשוטה: מלחמה פרצה והסתיימה, המחירים והמדדים עלו מאוד, ובשנה האחרונה הריבית במשק התחילה לרדת. המשכנתה שלכם נלקחה בעולם אחר.</w:t>
-      </w:r>
-    </w:p>
-    <w:p>
-      <w:pPr>
-        <w:spacing w:after="200" w:before="120"/>
-        <w:jc w:val="center"/>
+        <w:spacing w:after="0" w:before="0"/>
       </w:pPr>
       <w:r>
         <w:drawing>
           <wp:inline distT="0" distB="0" distL="0" distR="0">
-            <wp:extent cx="6477000" cy="1695450"/>
+            <wp:extent cx="7553325" cy="10677525"/>
             <wp:effectExtent t="0" r="0" b="0" l="0"/>
             <wp:docPr id="1" name="" descr="" title=""/>
             <wp:cNvGraphicFramePr>
@@ -110,7 +34,7 @@
                   <pic:spPr bwMode="auto">
                     <a:xfrm>
                       <a:off x="0" y="0"/>
-                      <a:ext cx="6477000" cy="1695450"/>
+                      <a:ext cx="7553325" cy="10677525"/>
                     </a:xfrm>
                     <a:prstGeom prst="rect">
                       <a:avLst/>
@@ -123,238 +47,9 @@
         </w:drawing>
       </w:r>
     </w:p>
-    <w:p>
-      <w:pPr>
-        <w:bidi/>
-        <w:spacing w:after="140" w:line="300"/>
-        <w:jc w:val="start"/>
-      </w:pPr>
-      <w:r>
-        <w:rPr>
-          <w:rFonts w:ascii="Arial" w:cs="Arial" w:eastAsia="Arial" w:hAnsi="Arial"/>
-          <w:b/>
-          <w:bCs/>
-          <w:color w:val="1F3A5F"/>
-          <w:sz w:val="25"/>
-          <w:szCs w:val="25"/>
-          <w:rtl/>
-        </w:rPr>
-        <w:t xml:space="preserve">מתי בפעם האחרונה בדקתם כמה הקרן ירדה ב-3 השנים האחרונות? </w:t>
-      </w:r>
-      <w:r>
-        <w:rPr>
-          <w:rFonts w:ascii="Arial" w:cs="Arial" w:eastAsia="Arial" w:hAnsi="Arial"/>
-          <w:sz w:val="25"/>
-          <w:szCs w:val="25"/>
-          <w:rtl/>
-        </w:rPr>
-        <w:t xml:space="preserve">במסלולים צמודי מדד, העלייה במדד מתווספת ליתרה, ולכן ייתכן שהקרן ירדה פחות ממה שחשבתם. </w:t>
-      </w:r>
-      <w:r>
-        <w:rPr>
-          <w:rFonts w:ascii="Arial" w:cs="Arial" w:eastAsia="Arial" w:hAnsi="Arial"/>
-          <w:b/>
-          <w:bCs/>
-          <w:sz w:val="25"/>
-          <w:szCs w:val="25"/>
-          <w:rtl/>
-        </w:rPr>
-        <w:t xml:space="preserve">זה הזמן לבדוק אם אתם משלמים לבנק כל חודש יותר ממה שצריך, ואם כן, לחסוך את זה.</w:t>
-      </w:r>
-    </w:p>
-    <w:p>
-      <w:pPr>
-        <w:spacing w:after="200" w:before="120"/>
-        <w:jc w:val="center"/>
-      </w:pPr>
-      <w:r>
-        <w:drawing>
-          <wp:inline distT="0" distB="0" distL="0" distR="0">
-            <wp:extent cx="6477000" cy="1524000"/>
-            <wp:effectExtent t="0" r="0" b="0" l="0"/>
-            <wp:docPr id="1" name="" descr="" title=""/>
-            <wp:cNvGraphicFramePr>
-              <a:graphicFrameLocks xmlns:a="http://schemas.openxmlformats.org/drawingml/2006/main" noChangeAspect="1"/>
-            </wp:cNvGraphicFramePr>
-            <a:graphic xmlns:a="http://schemas.openxmlformats.org/drawingml/2006/main">
-              <a:graphicData uri="http://schemas.openxmlformats.org/drawingml/2006/picture">
-                <pic:pic xmlns:pic="http://schemas.openxmlformats.org/drawingml/2006/picture">
-                  <pic:nvPicPr>
-                    <pic:cNvPr id="0" name="" descr=""/>
-                    <pic:cNvPicPr>
-                      <a:picLocks noChangeAspect="1" noChangeArrowheads="1"/>
-                    </pic:cNvPicPr>
-                  </pic:nvPicPr>
-                  <pic:blipFill>
-                    <a:blip r:embed="rId8" cstate="none"/>
-                    <a:srcRect/>
-                    <a:stretch>
-                      <a:fillRect/>
-                    </a:stretch>
-                  </pic:blipFill>
-                  <pic:spPr bwMode="auto">
-                    <a:xfrm>
-                      <a:off x="0" y="0"/>
-                      <a:ext cx="6477000" cy="1524000"/>
-                    </a:xfrm>
-                    <a:prstGeom prst="rect">
-                      <a:avLst/>
-                    </a:prstGeom>
-                  </pic:spPr>
-                </pic:pic>
-              </a:graphicData>
-            </a:graphic>
-          </wp:inline>
-        </w:drawing>
-      </w:r>
-    </w:p>
-    <w:p>
-      <w:pPr>
-        <w:bidi/>
-        <w:spacing w:after="260" w:line="300"/>
-        <w:jc w:val="start"/>
-      </w:pPr>
-      <w:r>
-        <w:rPr>
-          <w:rFonts w:ascii="Arial" w:cs="Arial" w:eastAsia="Arial" w:hAnsi="Arial"/>
-          <w:color w:val="6B7C90"/>
-          <w:sz w:val="21"/>
-          <w:szCs w:val="21"/>
-          <w:rtl/>
-        </w:rPr>
-        <w:t xml:space="preserve">לא כל אפשרות מתאימה לכל משפחה. החזר חודשי נמוך יותר לא תמיד אומר עלות כוללת נמוכה יותר, ולכן בודקים את שניהם.</w:t>
-      </w:r>
-    </w:p>
-    <w:tbl>
-      <w:tblPr>
-        <w:bidiVisual/>
-        <w:tblW w:type="dxa" w:w="10106"/>
-        <w:tblBorders>
-          <w:top w:val="single" w:color="auto" w:sz="4"/>
-          <w:left w:val="single" w:color="auto" w:sz="4"/>
-          <w:bottom w:val="single" w:color="auto" w:sz="4"/>
-          <w:right w:val="single" w:color="auto" w:sz="4"/>
-          <w:insideH w:val="single" w:color="auto" w:sz="4"/>
-          <w:insideV w:val="single" w:color="auto" w:sz="4"/>
-        </w:tblBorders>
-      </w:tblPr>
-      <w:tblGrid>
-        <w:gridCol w:w="10106"/>
-      </w:tblGrid>
-      <w:tr>
-        <w:tc>
-          <w:tcPr>
-            <w:tcW w:type="dxa" w:w="10106"/>
-            <w:tcBorders>
-              <w:top w:val="none" w:color="FFFFFF" w:sz="0"/>
-              <w:left w:val="none" w:color="FFFFFF" w:sz="0"/>
-              <w:bottom w:val="none" w:color="FFFFFF" w:sz="0"/>
-              <w:right w:val="none" w:color="FFFFFF" w:sz="0"/>
-            </w:tcBorders>
-            <w:shd w:fill="1F3A5F" w:color="auto" w:val="clear"/>
-            <w:tcMar>
-              <w:top w:type="dxa" w:w="300"/>
-              <w:left w:type="dxa" w:w="300"/>
-              <w:bottom w:type="dxa" w:w="300"/>
-              <w:right w:type="dxa" w:w="300"/>
-            </w:tcMar>
-            <w:vAlign w:val="center"/>
-          </w:tcPr>
-          <w:p>
-            <w:pPr>
-              <w:bidi/>
-              <w:spacing w:after="140" w:line="300"/>
-              <w:jc w:val="center"/>
-            </w:pPr>
-            <w:r>
-              <w:rPr>
-                <w:rFonts w:ascii="Arial" w:cs="Arial" w:eastAsia="Arial" w:hAnsi="Arial"/>
-                <w:b/>
-                <w:bCs/>
-                <w:color w:val="FFFFFF"/>
-                <w:sz w:val="32"/>
-                <w:szCs w:val="32"/>
-                <w:rtl/>
-              </w:rPr>
-              <w:t xml:space="preserve">הצעד הראשון פשוט: </w:t>
-            </w:r>
-            <w:r>
-              <w:rPr>
-                <w:rFonts w:ascii="Arial" w:cs="Arial" w:eastAsia="Arial" w:hAnsi="Arial"/>
-                <w:b/>
-                <w:bCs/>
-                <w:color w:val="7FE0B8"/>
-                <w:sz w:val="32"/>
-                <w:szCs w:val="32"/>
-                <w:rtl/>
-              </w:rPr>
-              <w:t xml:space="preserve">בדיקת משכנתה ראשונית ללא עלות</w:t>
-            </w:r>
-          </w:p>
-          <w:p>
-            <w:pPr>
-              <w:bidi/>
-              <w:spacing w:after="0" w:line="300"/>
-              <w:jc w:val="center"/>
-            </w:pPr>
-            <w:r>
-              <w:rPr>
-                <w:rFonts w:ascii="Arial" w:cs="Arial" w:eastAsia="Arial" w:hAnsi="Arial"/>
-                <w:b/>
-                <w:bCs/>
-                <w:color w:val="FFFFFF"/>
-                <w:sz w:val="24"/>
-                <w:szCs w:val="24"/>
-                <w:rtl/>
-              </w:rPr>
-              <w:t xml:space="preserve">שיראל פרגר</w:t>
-            </w:r>
-            <w:r>
-              <w:rPr>
-                <w:rFonts w:ascii="Arial" w:cs="Arial" w:eastAsia="Arial" w:hAnsi="Arial"/>
-                <w:color w:val="D5E0EE"/>
-                <w:sz w:val="22"/>
-                <w:szCs w:val="22"/>
-                <w:rtl/>
-              </w:rPr>
-              <w:t xml:space="preserve">  |  יועץ משכנתאות, נדל"ן ומימון  |  </w:t>
-            </w:r>
-            <w:r>
-              <w:rPr>
-                <w:rFonts w:ascii="Arial" w:cs="Arial" w:eastAsia="Arial" w:hAnsi="Arial"/>
-                <w:b/>
-                <w:bCs/>
-                <w:color w:val="FFFFFF"/>
-                <w:sz w:val="36"/>
-                <w:szCs w:val="36"/>
-                <w:rtl/>
-              </w:rPr>
-              <w:t xml:space="preserve">052-4415395</w:t>
-            </w:r>
-          </w:p>
-        </w:tc>
-      </w:tr>
-    </w:tbl>
-    <w:p>
-      <w:pPr>
-        <w:bidi/>
-        <w:spacing w:after="0" w:before="220" w:line="300"/>
-        <w:jc w:val="start"/>
-      </w:pPr>
-      <w:r>
-        <w:rPr>
-          <w:rFonts w:ascii="Arial" w:cs="Arial" w:eastAsia="Arial" w:hAnsi="Arial"/>
-          <w:color w:val="6B7C90"/>
-          <w:sz w:val="16"/>
-          <w:szCs w:val="16"/>
-          <w:rtl/>
-        </w:rPr>
-        <w:t xml:space="preserve">הנתונים: ריבית בנק ישראל (3.25%) ופריים (4.75%) נכונים לאוקטובר 2026 לפי בנק ישראל. עליית המדד: מדד המחירים לצרכן של הלמ"ס, מרץ 2023 עד אוגוסט 2026. המידע כללי ואינו מהווה ייעוץ אישי.</w:t>
-      </w:r>
-    </w:p>
     <w:sectPr>
       <w:pgSz w:w="11906" w:h="16838" w:orient="portrait"/>
-      <w:pgMar w:top="850" w:right="900" w:bottom="700" w:left="900" w:header="708" w:footer="708" w:gutter="0"/>
+      <w:pgMar w:top="0" w:right="0" w:bottom="0" w:left="0" w:header="0" w:footer="0" w:gutter="0"/>
       <w:pgNumType/>
       <w:docGrid w:linePitch="360"/>
     </w:sectPr>

</xml_diff>